<commit_message>
Link Playbook and Rebuild pages from the prep center nav.
Adds senior-prep and the senior playbook as same-tab menu links, ships hidden model answers for drills/claims, and refreshes resumes plus PWA shell files.

Co-authored-by: Cursor <cursoragent@cursor.com>
</commit_message>
<xml_diff>
--- a/resumes/Ziaur_Rahman_Master_Resume.docx
+++ b/resumes/Ziaur_Rahman_Master_Resume.docx
@@ -347,7 +347,7 @@
           <w:sz w:val="21"/>
           <w:szCs w:val="21"/>
         </w:rPr>
-        <w:t xml:space="preserve">Owned the AI recruitment product end to end — job postings, candidate intake, CV processing, AI-conducted interviews, scoring, and feedback — built on C#, ASP.NET Core, EF Core, and Azure SQL with a React and Next.js frontend. One of four products delivered in twelve months on a small engineering team.</w:t>
+        <w:t xml:space="preserve">Owned the AI recruitment product end to end — job postings, candidate intake, CV processing, AI-conducted interviews, scoring, and feedback — built on C#, ASP.NET Core, EF Core, and Azure SQL with a React and Next.js frontend, and a Python service handling LLM-based CV scoring. One of four products delivered in twelve months on a small engineering team.</w:t>
       </w:r>
     </w:p>
     <w:p>
@@ -383,7 +383,7 @@
           <w:sz w:val="21"/>
           <w:szCs w:val="21"/>
         </w:rPr>
-        <w:t xml:space="preserve">Shipped a lead-generation platform from data ingest through to bulk email delivery using Python, Supabase, and Next.js, deployed on Render.</w:t>
+        <w:t xml:space="preserve">Shipped a lead-generation platform from data ingest through to bulk email delivery using Next.js, TypeScript, and Supabase, deployed on Render.</w:t>
       </w:r>
     </w:p>
     <w:p>
@@ -906,7 +906,7 @@
           <w:sz w:val="21"/>
           <w:szCs w:val="21"/>
         </w:rPr>
-        <w:t xml:space="preserve">CoreBari (corebari.com)  ·  independent SaaS product, live in production</w:t>
+        <w:t xml:space="preserve">CoreBari (corebari.net)  ·  independent SaaS product, live in production</w:t>
       </w:r>
       <w:r>
         <w:rPr>
@@ -953,7 +953,7 @@
           <w:sz w:val="21"/>
           <w:szCs w:val="21"/>
         </w:rPr>
-        <w:t xml:space="preserve">  —  SaaS platform automating recruitment: CV processing, AI-conducted interviews, candidate scoring and feedback workflows.  </w:t>
+        <w:t xml:space="preserve">  —  SaaS platform automating recruitment: CV processing, AI-conducted interviews, candidate scoring and feedback workflows, with LLM scoring in a separate Python service.  </w:t>
       </w:r>
       <w:r>
         <w:rPr>
@@ -964,7 +964,7 @@
           <w:sz w:val="20"/>
           <w:szCs w:val="20"/>
         </w:rPr>
-        <w:t xml:space="preserve">C# · ASP.NET Core · EF Core · Azure SQL · React / Next.js</w:t>
+        <w:t xml:space="preserve">C# · ASP.NET Core · EF Core · Azure SQL · Python · React / Next.js</w:t>
       </w:r>
     </w:p>
     <w:p>
@@ -1003,7 +1003,7 @@
           <w:sz w:val="20"/>
           <w:szCs w:val="20"/>
         </w:rPr>
-        <w:t xml:space="preserve">Python · Supabase · Next.js · Render</w:t>
+        <w:t xml:space="preserve">Next.js · TypeScript · Supabase · Render</w:t>
       </w:r>
     </w:p>
     <w:p>

</xml_diff>